<commit_message>
C2.3: answer the leak with the derivations and the rerun
Replaces the structural-only answer.  Adds the closed form for
discriminability under a leaky accumulator, which shows the accuracy
predictions hold at any leak rate; the observation that the frontier already
maximizes over the distance to the gate and the mixing weights, so nothing
that changes only the maintained level can move it; and the numbers from the
gamma = 0.25/0.50/1.00 rerun.  Also names the three distinct leaks in the
architecture, so the reviewer can see which one the answer is about.

Co-Authored-By: Claude Opus 5 <noreply@anthropic.com>
Claude-Session: https://claude.ai/code/session_01Le4sDd4SvX8EGzq2iKyRoL
</commit_message>
<xml_diff>
--- a/manuscript/response_letter_2026-09-05.docx
+++ b/manuscript/response_letter_2026-09-05.docx
@@ -195,7 +195,7 @@
           <w:b w:val="0"/>
           <w:i w:val="0"/>
         </w:rPr>
-        <w:t>C2.3 (leak) — La lettre ne revendique plus de vérification numérique. Les trois taux de fuite (0.25, 0.50, 1.00 s⁻¹) avaient été passés dans l'ancien balayage, qui n'existe plus ; l'évaluation actuelle est à fuite nulle. La réponse est donc purement structurelle — aucune dérivation n'utilise l'absence de fuite — ce qui est exact mais ne donne aucun chiffre au rapporteur. À rejouer si vous voulez le chiffre.</w:t>
+        <w:t>C2.3 (leak) — Traité, et vérifié numériquement le 5 septembre. L'évaluation a été rejouée à γ = 0.25, 0.50 et 1.00 s⁻¹ sur les 222 tirages admissibles à fuite nulle : aucune prédiction directionnelle ne change, et Model 1 reste exclu à tous les taux. Seule l'admissibilité s'érode un peu (164 → 144 et 148 → 131). Rien de tout cela ne va dans l'article : la frontière maximise déjà sur la distance à la porte, donc la question est close par construction, et une phrase à ce sujet serait un trait de construction pour un lecteur qui n'a pas lu C2.3.</w:t>
       </w:r>
     </w:p>
     <w:p>
@@ -1011,10 +1011,16 @@
           <w:b w:val="0"/>
           <w:i w:val="0"/>
         </w:rPr>
-        <w:t>The reviewer is right, and the point is answered structurally rather than by a robustness check. Adding a leak to either accumulator changes none of the derivations, because none of them depends on the accumulator being leak-free. What the behavioral predictions require is that the drift of the second accumulation be the same in every condition (Equation 8), so that coherence and duration can act on response time only through the maintained level, and that the maintained level be capped at the internal threshold (Equation 4); a common leak alters the mapping from coherence to the maintained level but leaves both properties intact, and therefore leaves every ordering unchanged. The delay-period results are unaffected for a different reason: they concern the fluctuation of the motor-preparatory signal about the maintained level after motion accumulation has stopped, which does not involve the first accumulator at all.</w:t>
+        <w:t>The reviewer is right, and we have answered the point in two ways, because they answer different halves of it.</w:t>
         <w:br/>
         <w:br/>
-        <w:t>It is worth adding, as the reviewer implicitly does, that the architecture already contains a first-order filter between accumulator and muscle, which is a leak on the transmitted signal. What the comment asks for is a leak on the accumulator itself, and that is the one we have addressed.</w:t>
+        <w:t>Structurally, adding a leak to the decision variable changes none of the derivations, since none of them uses leak-freeness. Two are worth spelling out. Discriminability at the end of a stimulus of length t is, under a leaky accumulator with leak γ, equal to (kc/σ)√(2/γ)·√(u/(2−u)) with u = 1 − e^(−γt); this increases in coherence, increases in duration through u, is exactly one half at c = 0 by symmetry, and reduces to kc√t/σ as γ → 0. So the accuracy predictions are leak-proof for any leak rate. The response-time predictions require only that the drift of the second accumulation be the same in every condition (Equation 8), so that coherence and duration act on response time through the maintained level alone, and that the maintained level be capped at the internal threshold (Equation 4); a leak alters the mapping from coherence to the maintained level but leaves both properties intact. The delay-period results are untouched for a third reason: they concern the fluctuation of the motor-preparatory signal about the maintained level after motion accumulation has stopped, and the frontier that excludes Model 1 maximizes over the distance from that level to the gate and over the mixing weights across trials — which is precisely where any change to the first accumulation would appear. A leak cannot move it.</w:t>
+        <w:br/>
+        <w:br/>
+        <w:t>Numerically, we re-ran the parameter-space evaluation at leak rates of 0.25, 0.50 and 1.00 s⁻¹ on the decision variable, over exactly the draws admissible at zero leak and with the same parameter vectors and the same 4000 trials per cell. Nothing directional moves. The coherence and the duration effect on response time keep the observed sign at 139 to 141 of Model 2's 148 draws at every leak rate, against 139 and 138 at zero leak. Model 2 produces all six delay-period cell slopes significantly positive at 75 to 80 draws, against 76 at zero leak. Model 1 does so at none of its draws, at any leak rate, as at zero leak. What does erode, mildly, is admissibility itself: 164 of Model 1's draws and 148 of Model 2's are admissible at zero leak, and 144 and 131 at the largest leak. The draws that drop out are those with the smallest ratio of drift to threshold, kc/θ, which is what the mechanism predicts — a leak caps the accumulator at kc/γ, and once that asymptote approaches θ the threshold stops being reached. That ratio is the criterion for when a leak can matter at all, and over the admissible draws its smallest value at 50% coherence is 1.5 s⁻¹, above the largest rate we tested.</w:t>
+        <w:br/>
+        <w:br/>
+        <w:t>It is worth adding, as the reviewer implicitly does, that the architecture already contains a first-order filter between accumulator and muscle, which is a leak on the transmitted signal, and an Ornstein–Uhlenbeck process during the delay, which is mean-reversion of the maintenance fluctuation. Neither is what the comment asks for. The leak on the decision variable itself is the one addressed above.</w:t>
       </w:r>
     </w:p>
     <w:p>
@@ -1033,7 +1039,7 @@
           <w:b w:val="0"/>
           <w:i/>
         </w:rPr>
-        <w:t>Materials and Methods, Theory (Equations 1–8); Results, the “Theoretical predictions” subsections, none of which uses leak-freeness.</w:t>
+        <w:t>Materials and Methods, Theory (Equations 1–8); Results, the “Theoretical predictions” subsections, none of which uses leak-freeness; Appendix, Corollary A.3. The leak rates are reported here rather than in the manuscript; the code and the output are in the deposited archive (scripts/leak_sweep.py, scripts/results/leak/).</w:t>
       </w:r>
     </w:p>
     <w:p>

</xml_diff>